<commit_message>
grille commerciale v1.2 : une prime unique par garage, prime de fidélité supprimée (documents + espace éditeur)
</commit_message>
<xml_diff>
--- a/docs/pack-commercial/commerciaux/CONTRAT-APPORTEUR-AFFAIRES.docx
+++ b/docs/pack-commercial/commerciaux/CONTRAT-APPORTEUR-AFFAIRES.docx
@@ -265,7 +265,7 @@
           <w:sz w:val="20"/>
           <w:szCs w:val="20"/>
         </w:rPr>
-        <w:t xml:space="preserve">L'Apporteur perçoit, pour chaque contrat signé par un prospect qu'il a apporté, les commissions suivantes, fixées forfaitairement par formule souscrite (prime de signature égale à 85 % de la mensualité hors taxes, prime de fidélité égale à la moitié de la prime de signature) :</w:t>
+        <w:t xml:space="preserve">L'Apporteur perçoit, pour chaque contrat signé par un prospect qu'il a apporté, la prime suivante, fixée forfaitairement par formule souscrite (85 % de la mensualité hors taxes de la grille en vigueur) :</w:t>
       </w:r>
     </w:p>
     <w:tbl>
@@ -281,10 +281,9 @@
         </w:tblBorders>
       </w:tblPr>
       <w:tblGrid>
-        <w:gridCol w:w="3360"/>
-        <w:gridCol w:w="2000"/>
-        <w:gridCol w:w="2000"/>
-        <w:gridCol w:w="2000"/>
+        <w:gridCol w:w="3760"/>
+        <w:gridCol w:w="2800"/>
+        <w:gridCol w:w="2800"/>
       </w:tblGrid>
       <w:tr>
         <w:trPr>
@@ -292,7 +291,7 @@
         </w:trPr>
         <w:tc>
           <w:tcPr>
-            <w:tcW w:type="dxa" w:w="3360"/>
+            <w:tcW w:type="dxa" w:w="3760"/>
             <w:tcBorders>
               <w:top w:val="single" w:color="E4E6F0" w:sz="4"/>
               <w:left w:val="single" w:color="E4E6F0" w:sz="4"/>
@@ -328,7 +327,7 @@
         </w:tc>
         <w:tc>
           <w:tcPr>
-            <w:tcW w:type="dxa" w:w="2000"/>
+            <w:tcW w:type="dxa" w:w="2800"/>
             <w:tcBorders>
               <w:top w:val="single" w:color="E4E6F0" w:sz="4"/>
               <w:left w:val="single" w:color="E4E6F0" w:sz="4"/>
@@ -358,49 +357,13 @@
                 <w:sz w:val="18"/>
                 <w:szCs w:val="18"/>
               </w:rPr>
-              <w:t xml:space="preserve">Prime de signature</w:t>
+              <w:t xml:space="preserve">Prime (par garage signé)</w:t>
             </w:r>
           </w:p>
         </w:tc>
         <w:tc>
           <w:tcPr>
-            <w:tcW w:type="dxa" w:w="2000"/>
-            <w:tcBorders>
-              <w:top w:val="single" w:color="E4E6F0" w:sz="4"/>
-              <w:left w:val="single" w:color="E4E6F0" w:sz="4"/>
-              <w:bottom w:val="single" w:color="E4E6F0" w:sz="4"/>
-              <w:right w:val="single" w:color="E4E6F0" w:sz="4"/>
-            </w:tcBorders>
-            <w:shd w:fill="7C3AED" w:val="clear"/>
-            <w:tcMar>
-              <w:top w:type="dxa" w:w="80"/>
-              <w:left w:type="dxa" w:w="120"/>
-              <w:bottom w:type="dxa" w:w="80"/>
-              <w:right w:type="dxa" w:w="120"/>
-            </w:tcMar>
-            <w:vAlign w:val="center"/>
-          </w:tcPr>
-          <w:p>
-            <w:pPr>
-              <w:spacing w:after="0" w:line="260"/>
-              <w:jc w:val="center"/>
-            </w:pPr>
-            <w:r>
-              <w:rPr>
-                <w:rFonts w:ascii="Arial" w:cs="Arial" w:eastAsia="Arial" w:hAnsi="Arial"/>
-                <w:b/>
-                <w:bCs/>
-                <w:color w:val="FFFFFF"/>
-                <w:sz w:val="18"/>
-                <w:szCs w:val="18"/>
-              </w:rPr>
-              <w:t xml:space="preserve">Prime de fidélité</w:t>
-            </w:r>
-          </w:p>
-        </w:tc>
-        <w:tc>
-          <w:tcPr>
-            <w:tcW w:type="dxa" w:w="2000"/>
+            <w:tcW w:type="dxa" w:w="2800"/>
             <w:tcBorders>
               <w:top w:val="single" w:color="E4E6F0" w:sz="4"/>
               <w:left w:val="single" w:color="E4E6F0" w:sz="4"/>
@@ -441,7 +404,7 @@
         </w:trPr>
         <w:tc>
           <w:tcPr>
-            <w:tcW w:type="dxa" w:w="3360"/>
+            <w:tcW w:type="dxa" w:w="3760"/>
             <w:tcBorders>
               <w:top w:val="single" w:color="E4E6F0" w:sz="4"/>
               <w:left w:val="single" w:color="E4E6F0" w:sz="4"/>
@@ -477,7 +440,7 @@
         </w:tc>
         <w:tc>
           <w:tcPr>
-            <w:tcW w:type="dxa" w:w="2000"/>
+            <w:tcW w:type="dxa" w:w="2800"/>
             <w:tcBorders>
               <w:top w:val="single" w:color="E4E6F0" w:sz="4"/>
               <w:left w:val="single" w:color="E4E6F0" w:sz="4"/>
@@ -513,43 +476,7 @@
         </w:tc>
         <w:tc>
           <w:tcPr>
-            <w:tcW w:type="dxa" w:w="2000"/>
-            <w:tcBorders>
-              <w:top w:val="single" w:color="E4E6F0" w:sz="4"/>
-              <w:left w:val="single" w:color="E4E6F0" w:sz="4"/>
-              <w:bottom w:val="single" w:color="E4E6F0" w:sz="4"/>
-              <w:right w:val="single" w:color="E4E6F0" w:sz="4"/>
-            </w:tcBorders>
-            <w:shd w:fill="FFFFFF" w:val="clear"/>
-            <w:tcMar>
-              <w:top w:type="dxa" w:w="80"/>
-              <w:left w:type="dxa" w:w="120"/>
-              <w:bottom w:type="dxa" w:w="80"/>
-              <w:right w:type="dxa" w:w="120"/>
-            </w:tcMar>
-            <w:vAlign w:val="center"/>
-          </w:tcPr>
-          <w:p>
-            <w:pPr>
-              <w:spacing w:after="0" w:line="260"/>
-              <w:jc w:val="center"/>
-            </w:pPr>
-            <w:r>
-              <w:rPr>
-                <w:rFonts w:ascii="Arial" w:cs="Arial" w:eastAsia="Arial" w:hAnsi="Arial"/>
-                <w:b w:val="false"/>
-                <w:bCs w:val="false"/>
-                <w:color w:val="1E2233"/>
-                <w:sz w:val="19"/>
-                <w:szCs w:val="19"/>
-              </w:rPr>
-              <w:t xml:space="preserve">40 €</w:t>
-            </w:r>
-          </w:p>
-        </w:tc>
-        <w:tc>
-          <w:tcPr>
-            <w:tcW w:type="dxa" w:w="2000"/>
+            <w:tcW w:type="dxa" w:w="2800"/>
             <w:tcBorders>
               <w:top w:val="single" w:color="E4E6F0" w:sz="4"/>
               <w:left w:val="single" w:color="E4E6F0" w:sz="4"/>
@@ -590,7 +517,7 @@
         </w:trPr>
         <w:tc>
           <w:tcPr>
-            <w:tcW w:type="dxa" w:w="3360"/>
+            <w:tcW w:type="dxa" w:w="3760"/>
             <w:tcBorders>
               <w:top w:val="single" w:color="E4E6F0" w:sz="4"/>
               <w:left w:val="single" w:color="E4E6F0" w:sz="4"/>
@@ -626,7 +553,7 @@
         </w:tc>
         <w:tc>
           <w:tcPr>
-            <w:tcW w:type="dxa" w:w="2000"/>
+            <w:tcW w:type="dxa" w:w="2800"/>
             <w:tcBorders>
               <w:top w:val="single" w:color="E4E6F0" w:sz="4"/>
               <w:left w:val="single" w:color="E4E6F0" w:sz="4"/>
@@ -662,43 +589,7 @@
         </w:tc>
         <w:tc>
           <w:tcPr>
-            <w:tcW w:type="dxa" w:w="2000"/>
-            <w:tcBorders>
-              <w:top w:val="single" w:color="E4E6F0" w:sz="4"/>
-              <w:left w:val="single" w:color="E4E6F0" w:sz="4"/>
-              <w:bottom w:val="single" w:color="E4E6F0" w:sz="4"/>
-              <w:right w:val="single" w:color="E4E6F0" w:sz="4"/>
-            </w:tcBorders>
-            <w:shd w:fill="F6F7FB" w:val="clear"/>
-            <w:tcMar>
-              <w:top w:type="dxa" w:w="80"/>
-              <w:left w:type="dxa" w:w="120"/>
-              <w:bottom w:type="dxa" w:w="80"/>
-              <w:right w:type="dxa" w:w="120"/>
-            </w:tcMar>
-            <w:vAlign w:val="center"/>
-          </w:tcPr>
-          <w:p>
-            <w:pPr>
-              <w:spacing w:after="0" w:line="260"/>
-              <w:jc w:val="center"/>
-            </w:pPr>
-            <w:r>
-              <w:rPr>
-                <w:rFonts w:ascii="Arial" w:cs="Arial" w:eastAsia="Arial" w:hAnsi="Arial"/>
-                <w:b w:val="false"/>
-                <w:bCs w:val="false"/>
-                <w:color w:val="1E2233"/>
-                <w:sz w:val="19"/>
-                <w:szCs w:val="19"/>
-              </w:rPr>
-              <w:t xml:space="preserve">210 €</w:t>
-            </w:r>
-          </w:p>
-        </w:tc>
-        <w:tc>
-          <w:tcPr>
-            <w:tcW w:type="dxa" w:w="2000"/>
+            <w:tcW w:type="dxa" w:w="2800"/>
             <w:tcBorders>
               <w:top w:val="single" w:color="E4E6F0" w:sz="4"/>
               <w:left w:val="single" w:color="E4E6F0" w:sz="4"/>
@@ -739,7 +630,7 @@
         </w:trPr>
         <w:tc>
           <w:tcPr>
-            <w:tcW w:type="dxa" w:w="3360"/>
+            <w:tcW w:type="dxa" w:w="3760"/>
             <w:tcBorders>
               <w:top w:val="single" w:color="E4E6F0" w:sz="4"/>
               <w:left w:val="single" w:color="E4E6F0" w:sz="4"/>
@@ -775,7 +666,7 @@
         </w:tc>
         <w:tc>
           <w:tcPr>
-            <w:tcW w:type="dxa" w:w="2000"/>
+            <w:tcW w:type="dxa" w:w="2800"/>
             <w:tcBorders>
               <w:top w:val="single" w:color="E4E6F0" w:sz="4"/>
               <w:left w:val="single" w:color="E4E6F0" w:sz="4"/>
@@ -811,43 +702,7 @@
         </w:tc>
         <w:tc>
           <w:tcPr>
-            <w:tcW w:type="dxa" w:w="2000"/>
-            <w:tcBorders>
-              <w:top w:val="single" w:color="E4E6F0" w:sz="4"/>
-              <w:left w:val="single" w:color="E4E6F0" w:sz="4"/>
-              <w:bottom w:val="single" w:color="E4E6F0" w:sz="4"/>
-              <w:right w:val="single" w:color="E4E6F0" w:sz="4"/>
-            </w:tcBorders>
-            <w:shd w:fill="FFFFFF" w:val="clear"/>
-            <w:tcMar>
-              <w:top w:type="dxa" w:w="80"/>
-              <w:left w:type="dxa" w:w="120"/>
-              <w:bottom w:type="dxa" w:w="80"/>
-              <w:right w:type="dxa" w:w="120"/>
-            </w:tcMar>
-            <w:vAlign w:val="center"/>
-          </w:tcPr>
-          <w:p>
-            <w:pPr>
-              <w:spacing w:after="0" w:line="260"/>
-              <w:jc w:val="center"/>
-            </w:pPr>
-            <w:r>
-              <w:rPr>
-                <w:rFonts w:ascii="Arial" w:cs="Arial" w:eastAsia="Arial" w:hAnsi="Arial"/>
-                <w:b w:val="false"/>
-                <w:bCs w:val="false"/>
-                <w:color w:val="1E2233"/>
-                <w:sz w:val="19"/>
-                <w:szCs w:val="19"/>
-              </w:rPr>
-              <w:t xml:space="preserve">365 €</w:t>
-            </w:r>
-          </w:p>
-        </w:tc>
-        <w:tc>
-          <w:tcPr>
-            <w:tcW w:type="dxa" w:w="2000"/>
+            <w:tcW w:type="dxa" w:w="2800"/>
             <w:tcBorders>
               <w:top w:val="single" w:color="E4E6F0" w:sz="4"/>
               <w:left w:val="single" w:color="E4E6F0" w:sz="4"/>
@@ -888,7 +743,7 @@
         </w:trPr>
         <w:tc>
           <w:tcPr>
-            <w:tcW w:type="dxa" w:w="3360"/>
+            <w:tcW w:type="dxa" w:w="3760"/>
             <w:tcBorders>
               <w:top w:val="single" w:color="E4E6F0" w:sz="4"/>
               <w:left w:val="single" w:color="E4E6F0" w:sz="4"/>
@@ -924,7 +779,7 @@
         </w:tc>
         <w:tc>
           <w:tcPr>
-            <w:tcW w:type="dxa" w:w="2000"/>
+            <w:tcW w:type="dxa" w:w="2800"/>
             <w:tcBorders>
               <w:top w:val="single" w:color="E4E6F0" w:sz="4"/>
               <w:left w:val="single" w:color="E4E6F0" w:sz="4"/>
@@ -960,43 +815,7 @@
         </w:tc>
         <w:tc>
           <w:tcPr>
-            <w:tcW w:type="dxa" w:w="2000"/>
-            <w:tcBorders>
-              <w:top w:val="single" w:color="E4E6F0" w:sz="4"/>
-              <w:left w:val="single" w:color="E4E6F0" w:sz="4"/>
-              <w:bottom w:val="single" w:color="E4E6F0" w:sz="4"/>
-              <w:right w:val="single" w:color="E4E6F0" w:sz="4"/>
-            </w:tcBorders>
-            <w:shd w:fill="F6F7FB" w:val="clear"/>
-            <w:tcMar>
-              <w:top w:type="dxa" w:w="80"/>
-              <w:left w:type="dxa" w:w="120"/>
-              <w:bottom w:type="dxa" w:w="80"/>
-              <w:right w:type="dxa" w:w="120"/>
-            </w:tcMar>
-            <w:vAlign w:val="center"/>
-          </w:tcPr>
-          <w:p>
-            <w:pPr>
-              <w:spacing w:after="0" w:line="260"/>
-              <w:jc w:val="center"/>
-            </w:pPr>
-            <w:r>
-              <w:rPr>
-                <w:rFonts w:ascii="Arial" w:cs="Arial" w:eastAsia="Arial" w:hAnsi="Arial"/>
-                <w:b w:val="false"/>
-                <w:bCs w:val="false"/>
-                <w:color w:val="1E2233"/>
-                <w:sz w:val="19"/>
-                <w:szCs w:val="19"/>
-              </w:rPr>
-              <w:t xml:space="preserve">665 €</w:t>
-            </w:r>
-          </w:p>
-        </w:tc>
-        <w:tc>
-          <w:tcPr>
-            <w:tcW w:type="dxa" w:w="2000"/>
+            <w:tcW w:type="dxa" w:w="2800"/>
             <w:tcBorders>
               <w:top w:val="single" w:color="E4E6F0" w:sz="4"/>
               <w:left w:val="single" w:color="E4E6F0" w:sz="4"/>
@@ -1064,16 +883,16 @@
           <w:sz w:val="20"/>
           <w:szCs w:val="20"/>
         </w:rPr>
-        <w:t xml:space="preserve">Prime de signature : </w:t>
-      </w:r>
-      <w:r>
-        <w:rPr>
-          <w:rFonts w:ascii="Arial" w:cs="Arial" w:eastAsia="Arial" w:hAnsi="Arial"/>
-          <w:color w:val="1E2233"/>
-          <w:sz w:val="20"/>
-          <w:szCs w:val="20"/>
-        </w:rPr>
-        <w:t xml:space="preserve">acquise lorsque le garage a réglé sa deuxième mensualité.</w:t>
+        <w:t xml:space="preserve">Prime : </w:t>
+      </w:r>
+      <w:r>
+        <w:rPr>
+          <w:rFonts w:ascii="Arial" w:cs="Arial" w:eastAsia="Arial" w:hAnsi="Arial"/>
+          <w:color w:val="1E2233"/>
+          <w:sz w:val="20"/>
+          <w:szCs w:val="20"/>
+        </w:rPr>
+        <w:t xml:space="preserve">acquise lorsque le garage a réglé sa deuxième mensualité ; versée une seule fois par contrat. En cas de remise consentie au garage, la prime est réduite dans la même proportion, sans pouvoir être inférieure au montant prévu pour la formule ESSENTIEL. En cas de forfait annuel réglé en une fois, la prime est acquise à l'encaissement du forfait et calculée sur le douzième de celui-ci.</w:t>
       </w:r>
     </w:p>
     <w:p>
@@ -1094,16 +913,16 @@
           <w:sz w:val="20"/>
           <w:szCs w:val="20"/>
         </w:rPr>
-        <w:t xml:space="preserve">Prime de fidélité : </w:t>
-      </w:r>
-      <w:r>
-        <w:rPr>
-          <w:rFonts w:ascii="Arial" w:cs="Arial" w:eastAsia="Arial" w:hAnsi="Arial"/>
-          <w:color w:val="1E2233"/>
-          <w:sz w:val="20"/>
-          <w:szCs w:val="20"/>
-        </w:rPr>
-        <w:t xml:space="preserve">acquise lorsque le garage a réglé sa sixième mensualité sans avoir résilié.</w:t>
+        <w:t xml:space="preserve">Bonus engagement : </w:t>
+      </w:r>
+      <w:r>
+        <w:rPr>
+          <w:rFonts w:ascii="Arial" w:cs="Arial" w:eastAsia="Arial" w:hAnsi="Arial"/>
+          <w:color w:val="1E2233"/>
+          <w:sz w:val="20"/>
+          <w:szCs w:val="20"/>
+        </w:rPr>
+        <w:t xml:space="preserve">acquis avec la prime de signature lorsque le devis signé comporte un engagement de douze mois.</w:t>
       </w:r>
     </w:p>
     <w:p>
@@ -1124,16 +943,16 @@
           <w:sz w:val="20"/>
           <w:szCs w:val="20"/>
         </w:rPr>
-        <w:t xml:space="preserve">Bonus engagement : </w:t>
-      </w:r>
-      <w:r>
-        <w:rPr>
-          <w:rFonts w:ascii="Arial" w:cs="Arial" w:eastAsia="Arial" w:hAnsi="Arial"/>
-          <w:color w:val="1E2233"/>
-          <w:sz w:val="20"/>
-          <w:szCs w:val="20"/>
-        </w:rPr>
-        <w:t xml:space="preserve">acquis avec la prime de signature lorsque le devis signé comporte un engagement de douze mois.</w:t>
+        <w:t xml:space="preserve">Montée en formule : </w:t>
+      </w:r>
+      <w:r>
+        <w:rPr>
+          <w:rFonts w:ascii="Arial" w:cs="Arial" w:eastAsia="Arial" w:hAnsi="Arial"/>
+          <w:color w:val="1E2233"/>
+          <w:sz w:val="20"/>
+          <w:szCs w:val="20"/>
+        </w:rPr>
+        <w:t xml:space="preserve">lorsqu'un garage apporté souscrit une formule supérieure dans les douze mois suivant sa signature, l'Apporteur perçoit 85 % de la différence entre les deux mensualités hors taxes, aux conditions de la prime.</w:t>
       </w:r>
     </w:p>
     <w:p>
@@ -1154,36 +973,6 @@
           <w:sz w:val="20"/>
           <w:szCs w:val="20"/>
         </w:rPr>
-        <w:t xml:space="preserve">Montée en formule : </w:t>
-      </w:r>
-      <w:r>
-        <w:rPr>
-          <w:rFonts w:ascii="Arial" w:cs="Arial" w:eastAsia="Arial" w:hAnsi="Arial"/>
-          <w:color w:val="1E2233"/>
-          <w:sz w:val="20"/>
-          <w:szCs w:val="20"/>
-        </w:rPr>
-        <w:t xml:space="preserve">lorsqu'un garage apporté souscrit une formule supérieure dans les douze mois suivant sa signature, l'Apporteur perçoit 85 % de la différence entre les deux mensualités hors taxes, aux conditions de la prime de signature.</w:t>
-      </w:r>
-    </w:p>
-    <w:p>
-      <w:pPr>
-        <w:pStyle w:val="ListParagraph"/>
-        <w:numPr>
-          <w:ilvl w:val="0"/>
-          <w:numId w:val="2"/>
-        </w:numPr>
-        <w:spacing w:after="80" w:line="290"/>
-      </w:pPr>
-      <w:r>
-        <w:rPr>
-          <w:rFonts w:ascii="Arial" w:cs="Arial" w:eastAsia="Arial" w:hAnsi="Arial"/>
-          <w:b/>
-          <w:bCs/>
-          <w:color w:val="1E2233"/>
-          <w:sz w:val="20"/>
-          <w:szCs w:val="20"/>
-        </w:rPr>
         <w:t xml:space="preserve">Bonus de volume : </w:t>
       </w:r>
       <w:r>
@@ -1242,7 +1031,7 @@
           <w:sz w:val="20"/>
           <w:szCs w:val="20"/>
         </w:rPr>
-        <w:t xml:space="preserve">Si le garage résilie, cesse de payer ou obtient l'annulation de son contrat avant d'avoir réglé sa troisième mensualité, la prime de signature et le bonus engagement correspondants sont repris par compensation sur les commissions suivantes de l'Apporteur, dans la limite de ces commissions. Aucune commission n'est due sur un contrat conclu grâce à des informations inexactes fournies par l'Apporteur, ou obtenu en violation de l'article 7.</w:t>
+        <w:t xml:space="preserve">Si le garage résilie, cesse de payer ou obtient l'annulation de son contrat avant d'avoir réglé sa troisième mensualité, la prime et le bonus engagement correspondants sont repris par compensation sur les commissions suivantes de l'Apporteur, dans la limite de ces commissions. Aucune commission n'est due sur un contrat conclu grâce à des informations inexactes fournies par l'Apporteur, ou obtenu en violation de l'article 7.</w:t>
       </w:r>
     </w:p>
     <w:p>
@@ -1417,7 +1206,7 @@
           <w:sz w:val="20"/>
           <w:szCs w:val="20"/>
         </w:rPr>
-        <w:t xml:space="preserve">Le contrat est conclu pour une durée indéterminée à compter de sa signature. Chaque partie peut y mettre fin à tout moment par email ou lettre recommandée, moyennant un préavis d'un mois. Les commissions acquises avant la fin du contrat restent dues ; les primes de fidélité des contrats signés avant la fin du contrat restent dues si leurs conditions se réalisent dans les six mois suivant celle-ci. En cas de manquement grave (article 7 ou 8), IDEAFORMA peut résilier sans préavis par écrit motivé.</w:t>
+        <w:t xml:space="preserve">Le contrat est conclu pour une durée indéterminée à compter de sa signature. Chaque partie peut y mettre fin à tout moment par email ou lettre recommandée, moyennant un préavis d'un mois. Les commissions acquises avant la fin du contrat restent dues ; les primes des contrats signés avant la fin du contrat restent dues si leur condition d'acquisition se réalise dans les trois mois suivant celle-ci. En cas de manquement grave (article 7 ou 8), IDEAFORMA peut résilier sans préavis par écrit motivé.</w:t>
       </w:r>
     </w:p>
     <w:p>

</xml_diff>

<commit_message>
v10.0 : conditions de vente (remises engagement, année en 1 fois) gérées par l'éditeur, prime immédiate/différée + reprise, page publique /vente (code apporteur, fiche besoins, contrat+CGV signés, paiement sur place), /admin/ventes (validation → abonnement, fidélisation), pack commerciaux v1.3 — migration v55
</commit_message>
<xml_diff>
--- a/docs/pack-commercial/commerciaux/CONTRAT-APPORTEUR-AFFAIRES.docx
+++ b/docs/pack-commercial/commerciaux/CONTRAT-APPORTEUR-AFFAIRES.docx
@@ -33,7 +33,7 @@
           <w:sz w:val="40"/>
           <w:szCs w:val="40"/>
         </w:rPr>
-        <w:t xml:space="preserve">Contrat d'apporteur d'affaires</w:t>
+        <w:t>Contrat d'apporteur d'affaires — v1.3 (septembre 2026)</w:t>
       </w:r>
     </w:p>
     <w:p>
@@ -230,7 +230,7 @@
           <w:sz w:val="20"/>
           <w:szCs w:val="20"/>
         </w:rPr>
-        <w:t xml:space="preserve">Un prospect est réputé apporté par l'Apporteur lorsque celui-ci l'a déclaré par email à contact@myeasyauto.fr (dénomination, SIRET, contact, fiche besoins) et qu'IDEAFORMA en a accusé réception. Le prospect déclaré est protégé au nom de l'Apporteur pendant soixante (60) jours, renouvelables une fois sur justification d'un rendez-vous planifié. En cas de déclaration du même prospect par plusieurs apporteurs, la date du premier email fait foi. Un garage déjà client ou déjà en discussion avec IDEAFORMA à la date de déclaration n'ouvre pas droit à commission ; IDEAFORMA le signale dans son accusé de réception.</w:t>
+        <w:t>Un prospect est réputé apporté par l'Apporteur lorsque celui-ci l'a déclaré sur la page myeasyauto.fr/vente avec son code apporteur (ou, à défaut, par email à contact@myeasyauto.fr avec dénomination, SIRET, contact et fiche besoins) et qu'IDEAFORMA en a accusé réception. Le prospect ainsi déclaré est réservé à l'Apporteur pendant soixante (60) jours ; passé ce délai sans signature, il redevient libre. En cas de déclarations concurrentes, la première reçue prévaut. Le contrat conclu avec le garage n'est définitif qu'après validation par IDEAFORMA (création du compte), au plus tard sous cinq jours ouvrés ; IDEAFORMA peut refuser une vente non conforme à la grille ou aux conditions de vente en vigueur.</w:t>
       </w:r>
     </w:p>
     <w:p>
@@ -883,16 +883,15 @@
           <w:sz w:val="20"/>
           <w:szCs w:val="20"/>
         </w:rPr>
-        <w:t xml:space="preserve">Prime : </w:t>
-      </w:r>
-      <w:r>
-        <w:rPr>
-          <w:rFonts w:ascii="Arial" w:cs="Arial" w:eastAsia="Arial" w:hAnsi="Arial"/>
-          <w:color w:val="1E2233"/>
-          <w:sz w:val="20"/>
-          <w:szCs w:val="20"/>
-        </w:rPr>
-        <w:t xml:space="preserve">acquise lorsque le garage a réglé sa deuxième mensualité ; versée une seule fois par contrat. En cas de remise consentie au garage, la prime est réduite dans la même proportion, sans pouvoir être inférieure au montant prévu pour la formule ESSENTIEL. En cas de forfait annuel réglé en une fois, la prime est acquise à l'encaissement du forfait et calculée sur le douzième de celui-ci.</w:t>
+        <w:t>Prime : versée UNE seule fois par contrat. Elle est ACQUISE, lorsque le garage a souscrit un engagement de douze mois (ou payé l'année en une fois), dès l'encaissement par IDEAFORMA de la première mensualité (ou du forfait annuel) ; en l'absence d'engagement, elle est acquise à l'encaissement de la troisième mensualité, soit un différé de deux mois. Les remises prévues à la grille (engagement de douze mois, paiement annuel) ne réduisent pas la prime. Une remise exceptionnelle hors grille, qui ne peut être consentie qu'avec l'accord écrit d'IDEAFORMA, réduit la prime dans la même proportion, sans pouvoir être inférieure à 130 € pour ESSENTIEL ; le bonus engagement reste inchangé.</w:t>
+      </w:r>
+      <w:r>
+        <w:rPr>
+          <w:rFonts w:ascii="Arial" w:cs="Arial" w:eastAsia="Arial" w:hAnsi="Arial"/>
+          <w:color w:val="1E2233"/>
+          <w:sz w:val="20"/>
+          <w:szCs w:val="20"/>
+        </w:rPr>
       </w:r>
     </w:p>
     <w:p>
@@ -1031,7 +1030,7 @@
           <w:sz w:val="20"/>
           <w:szCs w:val="20"/>
         </w:rPr>
-        <w:t xml:space="preserve">Si le garage résilie, cesse de payer ou obtient l'annulation de son contrat avant d'avoir réglé sa troisième mensualité, la prime et le bonus engagement correspondants sont repris par compensation sur les commissions suivantes de l'Apporteur, dans la limite de ces commissions. Aucune commission n'est due sur un contrat conclu grâce à des informations inexactes fournies par l'Apporteur, ou obtenu en violation de l'article 7.</w:t>
+        <w:t>Si le garage résilie, cesse de payer, exerce un droit de rétractation ou obtient l'annulation de son contrat avant d'avoir réglé sa troisième mensualité, la prime et le bonus engagement correspondants sont repris : IDEAFORMA les compense sur les commissions dues à l'Apporteur au titre des relevés suivants et, à défaut de compensation possible, l'Apporteur les rembourse sous trente jours de la demande. La reprise s'applique que le garage ait ou non réglé l'indemnité de résiliation anticipée prévue à son propre contrat. Aucune commission n'est due sur une vente refusée par IDEAFORMA, sur une vente obtenue au moyen d'une promesse non prévue par les documents commerciaux, ni lorsque l'Apporteur a encaissé un paiement en son nom ou omis de déclarer sous quarante-huit heures un règlement remis par le garage.</w:t>
       </w:r>
     </w:p>
     <w:p>
@@ -1101,7 +1100,7 @@
           <w:sz w:val="20"/>
           <w:szCs w:val="20"/>
         </w:rPr>
-        <w:t xml:space="preserve">L'Apporteur présente les Services conformément aux documents commerciaux remis par IDEAFORMA (plaquette, guide, devis-type, grille tarifaire en vigueur). Il s'interdit toute promesse non prévue par ces documents, toute remise ou gratuité non autorisée par écrit, toute pratique commerciale déloyale ou dénigrement d'un concurrent. Il ne collecte auprès des garages que les informations nécessaires à la qualification et à la déclaration du prospect, les transmet exclusivement à IDEAFORMA et les supprime de ses propres supports dès la fin de la collaboration (RGPD). Il n'utilise le nom, la marque et le logo My Easy Auto que sur les supports fournis par IDEAFORMA.</w:t>
+        <w:t>L'Apporteur présente les Services conformément aux documents commerciaux remis par IDEAFORMA (plaquette, plaquette tarifaire, kit de vente, contrat d'abonnement et conditions générales de vente, grille de commissions en vigueur). Il fait lire au garage les conditions particulières et les conditions générales avant signature, notamment le caractère ferme de l'engagement de douze mois. Il s'interdit toute promesse non prévue par ces documents, toute remise hors grille sans accord écrit d'IDEAFORMA, et tout encaissement en son nom : les paiements sont libellés à l'ordre d'IDEAFORMA ou versés sur son compte, et déclarés dans la vente. Il utilise exclusivement le compte de démonstration fourni par IDEAFORMA pour ses présentations et n'y saisit aucune donnée réelle d'un garage. Il n'a pas qualité pour engager IDEAFORMA ni pour signer en son nom.</w:t>
       </w:r>
     </w:p>
     <w:p>

</xml_diff>

<commit_message>
v10.2 : compte commercial et espace Mes clients (fiche SIREN pré-remplie, questionnaire, simulation/devis/contrat PDF, double signature sur place, envoi, déclaration de vente, paiement virement/CB confirmé), suivi des portefeuilles dans l'espace éditeur, contrat d'apporteur : zone, portefeuille et exceptions — migration v57
</commit_message>
<xml_diff>
--- a/docs/pack-commercial/commerciaux/CONTRAT-APPORTEUR-AFFAIRES.docx
+++ b/docs/pack-commercial/commerciaux/CONTRAT-APPORTEUR-AFFAIRES.docx
@@ -216,7 +216,7 @@
           <w:sz w:val="26"/>
           <w:szCs w:val="26"/>
         </w:rPr>
-        <w:t xml:space="preserve">Article 3 — Déclaration et protection des prospects</w:t>
+        <w:t>Article 3 — Zone, portefeuille et déclaration des prospects</w:t>
       </w:r>
     </w:p>
     <w:p>
@@ -230,7 +230,7 @@
           <w:sz w:val="20"/>
           <w:szCs w:val="20"/>
         </w:rPr>
-        <w:t>Un prospect est réputé apporté par l'Apporteur lorsque celui-ci l'a déclaré sur la page myeasyauto.fr/vente avec son code apporteur (ou, à défaut, par email à contact@myeasyauto.fr avec dénomination, SIRET, contact et fiche besoins) et qu'IDEAFORMA en a accusé réception. Le prospect ainsi déclaré est réservé à l'Apporteur pendant soixante (60) jours ; passé ce délai sans signature, il redevient libre. En cas de déclarations concurrentes, la première reçue prévaut. Le contrat conclu avec le garage n'est définitif qu'après validation par IDEAFORMA (création du compte), au plus tard sous cinq jours ouvrés ; IDEAFORMA peut refuser une vente non conforme à la grille ou aux conditions de vente en vigueur.</w:t>
+        <w:t>3.1 Zone et portefeuille attribués. IDEAFORMA attribue à l'Apporteur une zone géographique et, le cas échéant, une liste de prospects (le « Portefeuille »), décrits en Annexe 1 et reproduits sur sa fiche dans l'espace éditeur. L'Apporteur prospecte exclusivement dans cette zone et ce Portefeuille ; un même garage ne peut être attribué qu'à un seul Apporteur. IDEAFORMA peut modifier la zone ou le Portefeuille avec un préavis d'un mois, sans effet sur les prospects déjà déclarés. 3.2 Déclaration. Un prospect est réputé apporté par l'Apporteur lorsqu'il a été déclaré dans son espace clients (fiche créée sur l'application, avec le SIREN du garage) ou sur la page myeasyauto.fr/vente avec son code apporteur, ou à défaut par email à contact@myeasyauto.fr. La date de création de la fiche fait foi. Le prospect déclaré est réservé à l'Apporteur pendant soixante (60) jours, renouvelables une fois sur justification d'un rendez-vous ; passé ce délai sans signature, il redevient libre. 3.3 Exceptions au Portefeuille. Par exception à l'exclusivité de zone, l'Apporteur peut apporter un garage situé hors de sa zone ou dans le Portefeuille d'un autre Apporteur dans deux cas seulement : (a) il s'agit d'une CONNAISSANCE PERSONNELLE, c'est-à-dire un garage avec lequel il entretenait une relation antérieure à la signature du présent contrat ; (b) il a été RECOMMANDÉ DIRECTEMENT à ce garage par un client qu'il a lui-même apporté. Dans les deux cas, l'Apporteur mentionne l'exception et sa justification (nature du lien, nom du client recommandant) dans la fiche du prospect au moment de sa création ; à défaut de justification à la création, l'exception ne peut être invoquée. Tout autre apport hors zone requiert l'accord écrit préalable d'IDEAFORMA. 3.4 Conflits. En cas de déclaration du même garage par deux Apporteurs, le prospect revient à celui qui l'a déclaré en premier ; si le second invoque une exception dûment justifiée à la création de sa fiche, IDEAFORMA tranche dans les dix jours, au vu des justifications, et sa décision s'impose aux deux Apporteurs. Un Apporteur qui démarche sciemment un garage attribué à un autre, ou qui invoque une exception inexacte, perd toute commission sur ce garage et s'expose à la résiliation du présent contrat pour faute. 3.5 Validation. Le contrat conclu avec le garage n'est définitif qu'après validation par IDEAFORMA (création du compte), au plus tard sous cinq jours ouvrés ; IDEAFORMA peut refuser une vente non conforme à la grille, aux conditions de vente ou au présent article.</w:t>
       </w:r>
     </w:p>
     <w:p>
@@ -1577,6 +1577,86 @@
       <w:r>
         <w:rPr>
           <w:rFonts w:ascii="Arial" w:cs="Arial" w:eastAsia="Arial" w:hAnsi="Arial"/>
+          <w:b/>
+          <w:i w:val="0"/>
+          <w:iCs/>
+          <w:sz w:val="24"/>
+          <w:szCs w:val="17"/>
+        </w:rPr>
+        <w:t>Annexe 1 — Zone et Portefeuille attribués à l'Apporteur</w:t>
+      </w:r>
+    </w:p>
+    <w:p>
+      <w:pPr>
+        <w:spacing w:after="140" w:before="60"/>
+      </w:pPr>
+      <w:r>
+        <w:rPr>
+          <w:rFonts w:ascii="Arial" w:cs="Arial" w:eastAsia="Arial" w:hAnsi="Arial"/>
+          <w:b w:val="0"/>
+          <w:i w:val="0"/>
+          <w:iCs/>
+          <w:sz w:val="20"/>
+          <w:szCs w:val="17"/>
+        </w:rPr>
+        <w:t>Zone géographique : ______________________________________________ (départements, communes ou périmètre décrit).</w:t>
+      </w:r>
+    </w:p>
+    <w:p>
+      <w:pPr>
+        <w:spacing w:after="140" w:before="60"/>
+      </w:pPr>
+      <w:r>
+        <w:rPr>
+          <w:rFonts w:ascii="Arial" w:cs="Arial" w:eastAsia="Arial" w:hAnsi="Arial"/>
+          <w:b w:val="0"/>
+          <w:i w:val="0"/>
+          <w:iCs/>
+          <w:sz w:val="20"/>
+          <w:szCs w:val="17"/>
+        </w:rPr>
+        <w:t>Portefeuille : ☐ tous les garages de la zone   ☐ liste jointe   ☐ description : ______________________________________________</w:t>
+      </w:r>
+    </w:p>
+    <w:p>
+      <w:pPr>
+        <w:spacing w:after="140" w:before="60"/>
+      </w:pPr>
+      <w:r>
+        <w:rPr>
+          <w:rFonts w:ascii="Arial" w:cs="Arial" w:eastAsia="Arial" w:hAnsi="Arial"/>
+          <w:b w:val="0"/>
+          <w:i w:val="0"/>
+          <w:iCs/>
+          <w:sz w:val="20"/>
+          <w:szCs w:val="17"/>
+        </w:rPr>
+        <w:t>Exclusions (garages déjà clients ou attribués à un autre Apporteur) : ______________________________________________</w:t>
+      </w:r>
+    </w:p>
+    <w:p>
+      <w:pPr>
+        <w:spacing w:after="140" w:before="60"/>
+      </w:pPr>
+      <w:r>
+        <w:rPr>
+          <w:rFonts w:ascii="Arial" w:cs="Arial" w:eastAsia="Arial" w:hAnsi="Arial"/>
+          <w:b w:val="0"/>
+          <w:i w:val="0"/>
+          <w:iCs/>
+          <w:sz w:val="18"/>
+          <w:szCs w:val="17"/>
+        </w:rPr>
+        <w:t>Cette annexe est reproduite sur la fiche du commercial dans l'espace éditeur (champs « Zone » et « Portefeuille »). Toute modification fait l'objet d'un email d'IDEAFORMA avec un mois de préavis (art. 3.1). Paraphes : IDEAFORMA ______   l'Apporteur ______</w:t>
+      </w:r>
+    </w:p>
+    <w:p>
+      <w:pPr>
+        <w:spacing w:after="140" w:before="60"/>
+      </w:pPr>
+      <w:r>
+        <w:rPr>
+          <w:rFonts w:ascii="Arial" w:cs="Arial" w:eastAsia="Arial" w:hAnsi="Arial"/>
           <w:i/>
           <w:iCs/>
           <w:color w:val="5B6078"/>

</xml_diff>